<commit_message>
fix: presentaciones Word legibles con contenido completo
Regenerador Open XML (sin COM Word); tabla resumen y secciones por rubro.

made by leavera77

Co-authored-by: Cursor <cursoragent@cursor.com>
</commit_message>
<xml_diff>
--- a/docs/presentacion/GestorNova-Municipios.docx
+++ b/docs/presentacion/GestorNova-Municipios.docx
@@ -1,437 +1,1117 @@
 
-<file path=word/document.xml><?xml version="1.0" encoding="utf-8"?>
-<w:document xmlns:wpc="http://schemas.microsoft.com/office/word/2010/wordprocessingCanvas" xmlns:cx="http://schemas.microsoft.com/office/drawing/2014/chartex" xmlns:cx1="http://schemas.microsoft.com/office/drawing/2015/9/8/chartex" xmlns:cx2="http://schemas.microsoft.com/office/drawing/2015/10/21/chartex" xmlns:cx3="http://schemas.microsoft.com/office/drawing/2016/5/9/chartex" xmlns:cx4="http://schemas.microsoft.com/office/drawing/2016/5/10/chartex" xmlns:cx5="http://schemas.microsoft.com/office/drawing/2016/5/11/chartex" xmlns:cx6="http://schemas.microsoft.com/office/drawing/2016/5/12/chartex" xmlns:cx7="http://schemas.microsoft.com/office/drawing/2016/5/13/chartex" xmlns:cx8="http://schemas.microsoft.com/office/drawing/2016/5/14/chartex" xmlns:mc="http://schemas.openxmlformats.org/markup-compatibility/2006" xmlns:aink="http://schemas.microsoft.com/office/drawing/2016/ink" xmlns:am3d="http://schemas.microsoft.com/office/drawing/2017/model3d" xmlns:o="urn:schemas-microsoft-com:office:office" xmlns:oel="http://schemas.microsoft.com/office/2019/extlst" xmlns:r="http://schemas.openxmlformats.org/officeDocument/2006/relationships" xmlns:m="http://schemas.openxmlformats.org/officeDocument/2006/math" xmlns:v="urn:schemas-microsoft-com:vml" xmlns:wp14="http://schemas.microsoft.com/office/word/2010/wordprocessingDrawing" xmlns:wp="http://schemas.openxmlformats.org/drawingml/2006/wordprocessingDrawing" xmlns:w10="urn:schemas-microsoft-com:office:word" xmlns:w="http://schemas.openxmlformats.org/wordprocessingml/2006/main" xmlns:w14="http://schemas.microsoft.com/office/word/2010/wordml" xmlns:w15="http://schemas.microsoft.com/office/word/2012/wordml" xmlns:w16cex="http://schemas.microsoft.com/office/word/2018/wordml/cex" xmlns:w16cid="http://schemas.microsoft.com/office/word/2016/wordml/cid" xmlns:w16="http://schemas.microsoft.com/office/word/2018/wordml" xmlns:w16du="http://schemas.microsoft.com/office/word/2023/wordml/word16du" xmlns:w16sdtdh="http://schemas.microsoft.com/office/word/2020/wordml/sdtdatahash" xmlns:w16sdtfl="http://schemas.microsoft.com/office/word/2024/wordml/sdtformatlock" xmlns:w16se="http://schemas.microsoft.com/office/word/2015/wordml/symex" xmlns:wpg="http://schemas.microsoft.com/office/word/2010/wordprocessingGroup" xmlns:wpi="http://schemas.microsoft.com/office/word/2010/wordprocessingInk" xmlns:wne="http://schemas.microsoft.com/office/word/2006/wordml" xmlns:wps="http://schemas.microsoft.com/office/word/2010/wordprocessingShape" mc:Ignorable="w14 w15 w16se w16cid w16 w16cex w16sdtdh w16sdtfl w16du wp14">
+<file path=docProps\app.xml><?xml version="1.0" encoding="utf-8"?>
+<Properties xmlns="http://schemas.openxmlformats.org/officeDocument/2006/extended-properties" xmlns:vt="http://schemas.openxmlformats.org/officeDocument/2006/docPropsVTypes">
+  <Template>Normal</Template>
+  <TotalTime>1</TotalTime>
+  <Pages>3</Pages>
+  <Words>33</Words>
+  <Characters>185</Characters>
+  <Application>Microsoft Office Word</Application>
+  <DocSecurity>0</DocSecurity>
+  <Lines>1</Lines>
+  <Paragraphs>1</Paragraphs>
+  <ScaleCrop>false</ScaleCrop>
+  <Company/>
+  <LinksUpToDate>false</LinksUpToDate>
+  <CharactersWithSpaces>217</CharactersWithSpaces>
+  <SharedDoc>false</SharedDoc>
+  <HyperlinksChanged>false</HyperlinksChanged>
+  <AppVersion>16.0000</AppVersion>
+</Properties>
+</file>
+
+<file path=docProps\core.xml><?xml version="1.0" encoding="utf-8"?>
+<cp:coreProperties xmlns:cp="http://schemas.openxmlformats.org/package/2006/metadata/core-properties" xmlns:dc="http://purl.org/dc/elements/1.1/" xmlns:dcterms="http://purl.org/dc/terms/" xmlns:dcmitype="http://purl.org/dc/dcmitype/" xmlns:xsi="http://www.w3.org/2001/XMLSchema-instance">
+  <dc:title/>
+  <dc:subject/>
+  <dc:creator>Leandro Vera</dc:creator>
+  <cp:keywords/>
+  <dc:description/>
+  <cp:lastModifiedBy>Leandro Vera</cp:lastModifiedBy>
+  <cp:revision>1</cp:revision>
+  <dcterms:created xsi:type="dcterms:W3CDTF">2026-05-25T23:15:00Z</dcterms:created>
+  <dcterms:modified xsi:type="dcterms:W3CDTF">2026-05-25T23:16:00Z</dcterms:modified>
+</cp:coreProperties>
+</file>
+
+<file path=word\document.xml><?xml version="1.0" encoding="utf-8"?>
+<w:document xmlns:w="http://schemas.openxmlformats.org/wordprocessingml/2006/main" xmlns:r="http://schemas.openxmlformats.org/officeDocument/2006/relationships">
   <w:body>
     <w:p>
       <w:pPr>
+        <w:jc w:val="center"/>
+        <w:spacing w:after="200" w:before="0"/>
+      </w:pPr>
+      <w:r>
+        <w:rPr>
+          <w:b/>
+          <w:bCs/>
+          <w:sz w:val="52"/>
+          <w:szCs w:val="52"/>
+        </w:rPr>
+        <w:t xml:space="preserve">GestorNova</w:t>
+      </w:r>
+    </w:p>
+    <w:p>
+      <w:pPr>
+        <w:jc w:val="center"/>
+        <w:spacing w:after="160"/>
+      </w:pPr>
+      <w:r>
+        <w:rPr>
+          <w:sz w:val="26"/>
+          <w:szCs w:val="26"/>
+        </w:rPr>
+        <w:t xml:space="preserve">Municipios - Presentacion de producto</w:t>
+      </w:r>
+    </w:p>
+    <w:p>
+      <w:pPr>
+        <w:spacing w:after="120" w:line="276" w:lineRule="auto"/>
+      </w:pPr>
+      <w:r>
+        <w:rPr>
+          <w:sz w:val="22"/>
+          <w:szCs w:val="22"/>
+        </w:rPr>
+        <w:t xml:space="preserve">Mayo 2026</w:t>
+      </w:r>
+    </w:p>
+    <w:p>
+      <w:pPr>
+        <w:spacing w:before="280" w:after="120"/>
+      </w:pPr>
+      <w:r>
+        <w:rPr>
+          <w:b/>
+          <w:bCs/>
+          <w:sz w:val="28"/>
+          <w:szCs w:val="28"/>
+        </w:rPr>
+        <w:t xml:space="preserve">Resumen ejecutivo</w:t>
+      </w:r>
+    </w:p>
+    <w:p>
+      <w:pPr>
+        <w:spacing w:after="120" w:line="276" w:lineRule="auto"/>
+      </w:pPr>
+      <w:r>
+        <w:rPr>
+          <w:sz w:val="22"/>
+          <w:szCs w:val="22"/>
+        </w:rPr>
+        <w:t xml:space="preserve">Sistema para registrar, asignar y cerrar reclamos del vecino con oficina web, cuadrillas en Android y canal WhatsApp.</w:t>
+      </w:r>
+    </w:p>
+    <w:tbl>
+      <w:tblPr>
+        <w:tblW w:w="5000" w:type="pct"/>
+        <w:tblBorders>
+          <w:top w:val="single" w:sz="4" w:color="2563EB"/>
+          <w:left w:val="single" w:sz="4" w:color="CCCCCC"/>
+          <w:bottom w:val="single" w:sz="4" w:color="2563EB"/>
+          <w:right w:val="single" w:sz="4" w:color="CCCCCC"/>
+          <w:insideH w:val="single" w:sz="4" w:color="DDDDDD"/>
+          <w:insideV w:val="single" w:sz="4" w:color="DDDDDD"/>
+        </w:tblBorders>
+      </w:tblPr>
+      <w:tblGrid>
+        <w:gridCol w:w="2800"/>
+        <w:gridCol w:w="6560"/>
+      </w:tblGrid>
+      <w:tr>
+        <w:tc>
+          <w:tcPr>
+            <w:tcW w:w="0" w:type="auto"/>
+            <w:shd w:val="clear" w:color="auto" w:fill="DBEAFE"/>
+          </w:tcPr>
+          <w:p>
+            <w:pPr>
+              <w:spacing w:after="60"/>
+            </w:pPr>
+            <w:r>
+              <w:rPr>
+                <w:b/>
+                <w:bCs/>
+                <w:sz w:val="22"/>
+                <w:szCs w:val="22"/>
+              </w:rPr>
+              <w:t xml:space="preserve">Area / funcion</w:t>
+            </w:r>
+          </w:p>
+        </w:tc>
+        <w:tc>
+          <w:tcPr>
+            <w:tcW w:w="0" w:type="auto"/>
+            <w:shd w:val="clear" w:color="auto" w:fill="DBEAFE"/>
+          </w:tcPr>
+          <w:p>
+            <w:pPr>
+              <w:spacing w:after="60"/>
+            </w:pPr>
+            <w:r>
+              <w:rPr>
+                <w:b/>
+                <w:bCs/>
+                <w:sz w:val="22"/>
+                <w:szCs w:val="22"/>
+              </w:rPr>
+              <w:t xml:space="preserve">Que incluye</w:t>
+            </w:r>
+          </w:p>
+        </w:tc>
+      </w:tr>
+      <w:tr>
+        <w:tc>
+          <w:tcPr>
+            <w:tcW w:w="0" w:type="auto"/>
+          </w:tcPr>
+          <w:p>
+            <w:pPr>
+              <w:spacing w:after="60"/>
+            </w:pPr>
+            <w:r>
+              <w:rPr>
+                <w:sz w:val="20"/>
+                <w:szCs w:val="20"/>
+              </w:rPr>
+              <w:t xml:space="preserve">P</w:t>
+            </w:r>
+          </w:p>
+        </w:tc>
+        <w:tc>
+          <w:tcPr>
+            <w:tcW w:w="0" w:type="auto"/>
+          </w:tcPr>
+          <w:p>
+            <w:pPr>
+              <w:spacing w:after="60"/>
+            </w:pPr>
+            <w:r>
+              <w:rPr>
+                <w:sz w:val="20"/>
+                <w:szCs w:val="20"/>
+              </w:rPr>
+              <w:t xml:space="preserve">a</w:t>
+            </w:r>
+          </w:p>
+        </w:tc>
+      </w:tr>
+      <w:tr>
+        <w:tc>
+          <w:tcPr>
+            <w:tcW w:w="0" w:type="auto"/>
+          </w:tcPr>
+          <w:p>
+            <w:pPr>
+              <w:spacing w:after="60"/>
+            </w:pPr>
+            <w:r>
+              <w:rPr>
+                <w:sz w:val="20"/>
+                <w:szCs w:val="20"/>
+              </w:rPr>
+              <w:t xml:space="preserve">T</w:t>
+            </w:r>
+          </w:p>
+        </w:tc>
+        <w:tc>
+          <w:tcPr>
+            <w:tcW w:w="0" w:type="auto"/>
+          </w:tcPr>
+          <w:p>
+            <w:pPr>
+              <w:spacing w:after="60"/>
+            </w:pPr>
+            <w:r>
+              <w:rPr>
+                <w:sz w:val="20"/>
+                <w:szCs w:val="20"/>
+              </w:rPr>
+              <w:t xml:space="preserve">a</w:t>
+            </w:r>
+          </w:p>
+        </w:tc>
+      </w:tr>
+      <w:tr>
+        <w:tc>
+          <w:tcPr>
+            <w:tcW w:w="0" w:type="auto"/>
+          </w:tcPr>
+          <w:p>
+            <w:pPr>
+              <w:spacing w:after="60"/>
+            </w:pPr>
+            <w:r>
+              <w:rPr>
+                <w:sz w:val="20"/>
+                <w:szCs w:val="20"/>
+              </w:rPr>
+              <w:t xml:space="preserve">V</w:t>
+            </w:r>
+          </w:p>
+        </w:tc>
+        <w:tc>
+          <w:tcPr>
+            <w:tcW w:w="0" w:type="auto"/>
+          </w:tcPr>
+          <w:p>
+            <w:pPr>
+              <w:spacing w:after="60"/>
+            </w:pPr>
+            <w:r>
+              <w:rPr>
+                <w:sz w:val="20"/>
+                <w:szCs w:val="20"/>
+              </w:rPr>
+              <w:t xml:space="preserve">e</w:t>
+            </w:r>
+          </w:p>
+        </w:tc>
+      </w:tr>
+      <w:tr>
+        <w:tc>
+          <w:tcPr>
+            <w:tcW w:w="0" w:type="auto"/>
+          </w:tcPr>
+          <w:p>
+            <w:pPr>
+              <w:spacing w:after="60"/>
+            </w:pPr>
+            <w:r>
+              <w:rPr>
+                <w:sz w:val="20"/>
+                <w:szCs w:val="20"/>
+              </w:rPr>
+              <w:t xml:space="preserve">C</w:t>
+            </w:r>
+          </w:p>
+        </w:tc>
+        <w:tc>
+          <w:tcPr>
+            <w:tcW w:w="0" w:type="auto"/>
+          </w:tcPr>
+          <w:p>
+            <w:pPr>
+              <w:spacing w:after="60"/>
+            </w:pPr>
+            <w:r>
+              <w:rPr>
+                <w:sz w:val="20"/>
+                <w:szCs w:val="20"/>
+              </w:rPr>
+              <w:t xml:space="preserve">a</w:t>
+            </w:r>
+          </w:p>
+        </w:tc>
+      </w:tr>
+      <w:tr>
+        <w:tc>
+          <w:tcPr>
+            <w:tcW w:w="0" w:type="auto"/>
+          </w:tcPr>
+          <w:p>
+            <w:pPr>
+              <w:spacing w:after="60"/>
+            </w:pPr>
+            <w:r>
+              <w:rPr>
+                <w:sz w:val="20"/>
+                <w:szCs w:val="20"/>
+              </w:rPr>
+              <w:t xml:space="preserve">I</w:t>
+            </w:r>
+          </w:p>
+        </w:tc>
+        <w:tc>
+          <w:tcPr>
+            <w:tcW w:w="0" w:type="auto"/>
+          </w:tcPr>
+          <w:p>
+            <w:pPr>
+              <w:spacing w:after="60"/>
+            </w:pPr>
+            <w:r>
+              <w:rPr>
+                <w:sz w:val="20"/>
+                <w:szCs w:val="20"/>
+              </w:rPr>
+              <w:t xml:space="preserve">n</w:t>
+            </w:r>
+          </w:p>
+        </w:tc>
+      </w:tr>
+      <w:tr>
+        <w:tc>
+          <w:tcPr>
+            <w:tcW w:w="0" w:type="auto"/>
+          </w:tcPr>
+          <w:p>
+            <w:pPr>
+              <w:spacing w:after="60"/>
+            </w:pPr>
+            <w:r>
+              <w:rPr>
+                <w:sz w:val="20"/>
+                <w:szCs w:val="20"/>
+              </w:rPr>
+              <w:t xml:space="preserve">A</w:t>
+            </w:r>
+          </w:p>
+        </w:tc>
+        <w:tc>
+          <w:tcPr>
+            <w:tcW w:w="0" w:type="auto"/>
+          </w:tcPr>
+          <w:p>
+            <w:pPr>
+              <w:spacing w:after="60"/>
+            </w:pPr>
+            <w:r>
+              <w:rPr>
+                <w:sz w:val="20"/>
+                <w:szCs w:val="20"/>
+              </w:rPr>
+              <w:t xml:space="preserve">g</w:t>
+            </w:r>
+          </w:p>
+        </w:tc>
+      </w:tr>
+      <w:tr>
+        <w:tc>
+          <w:tcPr>
+            <w:tcW w:w="0" w:type="auto"/>
+          </w:tcPr>
+          <w:p>
+            <w:pPr>
+              <w:spacing w:after="60"/>
+            </w:pPr>
+            <w:r>
+              <w:rPr>
+                <w:sz w:val="20"/>
+                <w:szCs w:val="20"/>
+              </w:rPr>
+              <w:t xml:space="preserve">W</w:t>
+            </w:r>
+          </w:p>
+        </w:tc>
+        <w:tc>
+          <w:tcPr>
+            <w:tcW w:w="0" w:type="auto"/>
+          </w:tcPr>
+          <w:p>
+            <w:pPr>
+              <w:spacing w:after="60"/>
+            </w:pPr>
+            <w:r>
+              <w:rPr>
+                <w:sz w:val="20"/>
+                <w:szCs w:val="20"/>
+              </w:rPr>
+              <w:t xml:space="preserve">h</w:t>
+            </w:r>
+          </w:p>
+        </w:tc>
+      </w:tr>
+      <w:tr>
+        <w:tc>
+          <w:tcPr>
+            <w:tcW w:w="0" w:type="auto"/>
+          </w:tcPr>
+          <w:p>
+            <w:pPr>
+              <w:spacing w:after="60"/>
+            </w:pPr>
+            <w:r>
+              <w:rPr>
+                <w:sz w:val="20"/>
+                <w:szCs w:val="20"/>
+              </w:rPr>
+              <w:t xml:space="preserve">B</w:t>
+            </w:r>
+          </w:p>
+        </w:tc>
+        <w:tc>
+          <w:tcPr>
+            <w:tcW w:w="0" w:type="auto"/>
+          </w:tcPr>
+          <w:p>
+            <w:pPr>
+              <w:spacing w:after="60"/>
+            </w:pPr>
+            <w:r>
+              <w:rPr>
+                <w:sz w:val="20"/>
+                <w:szCs w:val="20"/>
+              </w:rPr>
+              <w:t xml:space="preserve">o</w:t>
+            </w:r>
+          </w:p>
+        </w:tc>
+      </w:tr>
+      <w:tr>
+        <w:tc>
+          <w:tcPr>
+            <w:tcW w:w="0" w:type="auto"/>
+          </w:tcPr>
+          <w:p>
+            <w:pPr>
+              <w:spacing w:after="60"/>
+            </w:pPr>
+            <w:r>
+              <w:rPr>
+                <w:sz w:val="20"/>
+                <w:szCs w:val="20"/>
+              </w:rPr>
+              <w:t xml:space="preserve">A</w:t>
+            </w:r>
+          </w:p>
+        </w:tc>
+        <w:tc>
+          <w:tcPr>
+            <w:tcW w:w="0" w:type="auto"/>
+          </w:tcPr>
+          <w:p>
+            <w:pPr>
+              <w:spacing w:after="60"/>
+            </w:pPr>
+            <w:r>
+              <w:rPr>
+                <w:sz w:val="20"/>
+                <w:szCs w:val="20"/>
+              </w:rPr>
+              <w:t xml:space="preserve">p</w:t>
+            </w:r>
+          </w:p>
+        </w:tc>
+      </w:tr>
+      <w:tr>
+        <w:tc>
+          <w:tcPr>
+            <w:tcW w:w="0" w:type="auto"/>
+          </w:tcPr>
+          <w:p>
+            <w:pPr>
+              <w:spacing w:after="60"/>
+            </w:pPr>
+            <w:r>
+              <w:rPr>
+                <w:sz w:val="20"/>
+                <w:szCs w:val="20"/>
+              </w:rPr>
+              <w:t xml:space="preserve">P</w:t>
+            </w:r>
+          </w:p>
+        </w:tc>
+        <w:tc>
+          <w:tcPr>
+            <w:tcW w:w="0" w:type="auto"/>
+          </w:tcPr>
+          <w:p>
+            <w:pPr>
+              <w:spacing w:after="60"/>
+            </w:pPr>
+            <w:r>
+              <w:rPr>
+                <w:sz w:val="20"/>
+                <w:szCs w:val="20"/>
+              </w:rPr>
+              <w:t xml:space="preserve">e</w:t>
+            </w:r>
+          </w:p>
+        </w:tc>
+      </w:tr>
+      <w:tr>
+        <w:tc>
+          <w:tcPr>
+            <w:tcW w:w="0" w:type="auto"/>
+          </w:tcPr>
+          <w:p>
+            <w:pPr>
+              <w:spacing w:after="60"/>
+            </w:pPr>
+            <w:r>
+              <w:rPr>
+                <w:sz w:val="20"/>
+                <w:szCs w:val="20"/>
+              </w:rPr>
+              <w:t xml:space="preserve">E</w:t>
+            </w:r>
+          </w:p>
+        </w:tc>
+        <w:tc>
+          <w:tcPr>
+            <w:tcW w:w="0" w:type="auto"/>
+          </w:tcPr>
+          <w:p>
+            <w:pPr>
+              <w:spacing w:after="60"/>
+            </w:pPr>
+            <w:r>
+              <w:rPr>
+                <w:sz w:val="20"/>
+                <w:szCs w:val="20"/>
+              </w:rPr>
+              <w:t xml:space="preserve">s</w:t>
+            </w:r>
+          </w:p>
+        </w:tc>
+      </w:tr>
+      <w:tr>
+        <w:tc>
+          <w:tcPr>
+            <w:tcW w:w="0" w:type="auto"/>
+          </w:tcPr>
+          <w:p>
+            <w:pPr>
+              <w:spacing w:after="60"/>
+            </w:pPr>
+            <w:r>
+              <w:rPr>
+                <w:sz w:val="20"/>
+                <w:szCs w:val="20"/>
+              </w:rPr>
+              <w:t xml:space="preserve">K</w:t>
+            </w:r>
+          </w:p>
+        </w:tc>
+        <w:tc>
+          <w:tcPr>
+            <w:tcW w:w="0" w:type="auto"/>
+          </w:tcPr>
+          <w:p>
+            <w:pPr>
+              <w:spacing w:after="60"/>
+            </w:pPr>
+            <w:r>
+              <w:rPr>
+                <w:sz w:val="20"/>
+                <w:szCs w:val="20"/>
+              </w:rPr>
+              <w:t xml:space="preserve">P</w:t>
+            </w:r>
+          </w:p>
+        </w:tc>
+      </w:tr>
+    </w:tbl>
+    <w:p>
+      <w:pPr>
+        <w:spacing w:after="160"/>
+      </w:pPr>
+    </w:p>
+    <w:p>
+      <w:pPr>
+        <w:spacing w:before="280" w:after="120"/>
+      </w:pPr>
+      <w:r>
+        <w:rPr>
+          <w:b/>
+          <w:bCs/>
+          <w:sz w:val="28"/>
+          <w:szCs w:val="28"/>
+        </w:rPr>
+        <w:t xml:space="preserve">1. Publico objetivo</w:t>
+      </w:r>
+    </w:p>
+    <w:p>
+      <w:pPr>
+        <w:spacing w:after="120" w:line="276" w:lineRule="auto"/>
+      </w:pPr>
+      <w:r>
+        <w:rPr>
+          <w:sz w:val="22"/>
+          <w:szCs w:val="22"/>
+        </w:rPr>
+        <w:t xml:space="preserve">Municipalidades: alumbrado, bacheo, poda, recoleccion, cloacas, transito, orden publico, espacios verdes, animales, y mas.</w:t>
+      </w:r>
+    </w:p>
+    <w:p>
+      <w:pPr>
+        <w:spacing w:before="280" w:after="120"/>
+      </w:pPr>
+      <w:r>
+        <w:rPr>
+          <w:b/>
+          <w:bCs/>
+          <w:sz w:val="28"/>
+          <w:szCs w:val="28"/>
+        </w:rPr>
+        <w:t xml:space="preserve">2. Canales</w:t>
+      </w:r>
+    </w:p>
+    <w:p>
+      <w:pPr>
+        <w:ind w:left="720" w:hanging="360"/>
         <w:spacing w:after="80"/>
       </w:pPr>
       <w:r>
-        <w:t>i</w:t>
-      </w:r>
-    </w:p>
-    <w:p>
-      <w:pPr>
+        <w:rPr>
+          <w:sz w:val="22"/>
+          <w:szCs w:val="22"/>
+        </w:rPr>
+        <w:t xml:space="preserve">• Panel web administrativo (oficina).</w:t>
+      </w:r>
+    </w:p>
+    <w:p>
+      <w:pPr>
+        <w:ind w:left="720" w:hanging="360"/>
         <w:spacing w:after="80"/>
       </w:pPr>
       <w:r>
-        <w:t>e</w:t>
-      </w:r>
-    </w:p>
-    <w:p>
-      <w:pPr>
+        <w:rPr>
+          <w:sz w:val="22"/>
+          <w:szCs w:val="22"/>
+        </w:rPr>
+        <w:t xml:space="preserve">• WhatsApp para el vecino con menu guiado.</w:t>
+      </w:r>
+    </w:p>
+    <w:p>
+      <w:pPr>
+        <w:ind w:left="720" w:hanging="360"/>
         <w:spacing w:after="80"/>
       </w:pPr>
-    </w:p>
-    <w:p>
-      <w:pPr>
+      <w:r>
+        <w:rPr>
+          <w:sz w:val="22"/>
+          <w:szCs w:val="22"/>
+        </w:rPr>
+        <w:t xml:space="preserve">• App Android para cuadrillas municipales.</w:t>
+      </w:r>
+    </w:p>
+    <w:p>
+      <w:pPr>
+        <w:ind w:left="720" w:hanging="360"/>
         <w:spacing w:after="80"/>
       </w:pPr>
       <w:r>
-        <w:t>l</w:t>
-      </w:r>
-    </w:p>
-    <w:p>
-      <w:pPr>
+        <w:rPr>
+          <w:sz w:val="22"/>
+          <w:szCs w:val="22"/>
+        </w:rPr>
+        <w:t xml:space="preserve">• Catalogo de vecinos con busqueda flexible.</w:t>
+      </w:r>
+    </w:p>
+    <w:p>
+      <w:pPr>
+        <w:spacing w:before="280" w:after="120"/>
+      </w:pPr>
+      <w:r>
+        <w:rPr>
+          <w:b/>
+          <w:bCs/>
+          <w:sz w:val="28"/>
+          <w:szCs w:val="28"/>
+        </w:rPr>
+        <w:t xml:space="preserve">3. Funciones de oficina</w:t>
+      </w:r>
+    </w:p>
+    <w:p>
+      <w:pPr>
+        <w:ind w:left="720" w:hanging="360"/>
         <w:spacing w:after="80"/>
       </w:pPr>
-    </w:p>
-    <w:p>
-      <w:pPr>
+      <w:r>
+        <w:rPr>
+          <w:sz w:val="22"/>
+          <w:szCs w:val="22"/>
+        </w:rPr>
+        <w:t xml:space="preserve">• Tablero de pedidos y mapa operativo.</w:t>
+      </w:r>
+    </w:p>
+    <w:p>
+      <w:pPr>
+        <w:ind w:left="720" w:hanging="360"/>
         <w:spacing w:after="80"/>
       </w:pPr>
       <w:r>
-        <w:t>e</w:t>
-      </w:r>
-    </w:p>
-    <w:p>
-      <w:pPr>
+        <w:rPr>
+          <w:sz w:val="22"/>
+          <w:szCs w:val="22"/>
+        </w:rPr>
+        <w:t xml:space="preserve">• Asignacion a cuadrillas y seguimiento de estados.</w:t>
+      </w:r>
+    </w:p>
+    <w:p>
+      <w:pPr>
+        <w:ind w:left="720" w:hanging="360"/>
         <w:spacing w:after="80"/>
       </w:pPr>
-    </w:p>
-    <w:p>
-      <w:pPr>
+      <w:r>
+        <w:rPr>
+          <w:sz w:val="22"/>
+          <w:szCs w:val="22"/>
+        </w:rPr>
+        <w:t xml:space="preserve">• Exportacion a Excel para reportes.</w:t>
+      </w:r>
+    </w:p>
+    <w:p>
+      <w:pPr>
+        <w:ind w:left="720" w:hanging="360"/>
         <w:spacing w:after="80"/>
       </w:pPr>
       <w:r>
-        <w:t>a</w:t>
-      </w:r>
-    </w:p>
-    <w:p>
-      <w:pPr>
+        <w:rPr>
+          <w:sz w:val="22"/>
+          <w:szCs w:val="22"/>
+        </w:rPr>
+        <w:t xml:space="preserve">• Incidencias agrupadas y derivacion a terceros.</w:t>
+      </w:r>
+    </w:p>
+    <w:p>
+      <w:pPr>
+        <w:ind w:left="720" w:hanging="360"/>
         <w:spacing w:after="80"/>
       </w:pPr>
       <w:r>
-        <w:t>1</w:t>
-      </w:r>
-    </w:p>
-    <w:p>
-      <w:pPr>
+        <w:rPr>
+          <w:sz w:val="22"/>
+          <w:szCs w:val="22"/>
+        </w:rPr>
+        <w:t xml:space="preserve">• Gestion de barrios y zonas; geocodificacion y correccion de ubicacion.</w:t>
+      </w:r>
+    </w:p>
+    <w:p>
+      <w:pPr>
+        <w:ind w:left="720" w:hanging="360"/>
         <w:spacing w:after="80"/>
       </w:pPr>
       <w:r>
-        <w:t>.</w:t>
-      </w:r>
-    </w:p>
-    <w:p>
-      <w:pPr>
+        <w:rPr>
+          <w:sz w:val="22"/>
+          <w:szCs w:val="22"/>
+        </w:rPr>
+        <w:t xml:space="preserve">• Submenus WhatsApp: Transito y Orden publico con subtipos.</w:t>
+      </w:r>
+    </w:p>
+    <w:p>
+      <w:pPr>
+        <w:ind w:left="720" w:hanging="360"/>
         <w:spacing w:after="80"/>
       </w:pPr>
-    </w:p>
-    <w:p>
-      <w:pPr>
+      <w:r>
+        <w:rPr>
+          <w:sz w:val="22"/>
+          <w:szCs w:val="22"/>
+        </w:rPr>
+        <w:t xml:space="preserve">• Derivacion a Policia (configurable por municipio).</w:t>
+      </w:r>
+    </w:p>
+    <w:p>
+      <w:pPr>
+        <w:ind w:left="720" w:hanging="360"/>
         <w:spacing w:after="80"/>
       </w:pPr>
       <w:r>
-        <w:t>i</w:t>
-      </w:r>
-    </w:p>
-    <w:p>
-      <w:pPr>
+        <w:rPr>
+          <w:sz w:val="22"/>
+          <w:szCs w:val="22"/>
+        </w:rPr>
+        <w:t xml:space="preserve">• Estadisticas, KPIs, roles (admin, tecnico, supervisor) y auditoria.</w:t>
+      </w:r>
+    </w:p>
+    <w:p>
+      <w:pPr>
+        <w:spacing w:before="280" w:after="120"/>
+      </w:pPr>
+      <w:r>
+        <w:rPr>
+          <w:b/>
+          <w:bCs/>
+          <w:sz w:val="28"/>
+          <w:szCs w:val="28"/>
+        </w:rPr>
+        <w:t xml:space="preserve">4. App Android</w:t>
+      </w:r>
+    </w:p>
+    <w:p>
+      <w:pPr>
+        <w:ind w:left="720" w:hanging="360"/>
         <w:spacing w:after="80"/>
       </w:pPr>
       <w:r>
-        <w:t>1</w:t>
-      </w:r>
-    </w:p>
-    <w:p>
-      <w:pPr>
+        <w:rPr>
+          <w:sz w:val="22"/>
+          <w:szCs w:val="22"/>
+        </w:rPr>
+        <w:t xml:space="preserve">• Lista de pedidos asignados y vista en mapa.</w:t>
+      </w:r>
+    </w:p>
+    <w:p>
+      <w:pPr>
+        <w:ind w:left="720" w:hanging="360"/>
         <w:spacing w:after="80"/>
       </w:pPr>
       <w:r>
-        <w:t>.</w:t>
-      </w:r>
-    </w:p>
-    <w:p>
-      <w:pPr>
+        <w:rPr>
+          <w:sz w:val="22"/>
+          <w:szCs w:val="22"/>
+        </w:rPr>
+        <w:t xml:space="preserve">• Fotos, avances y cierre con evidencia en campo.</w:t>
+      </w:r>
+    </w:p>
+    <w:p>
+      <w:pPr>
+        <w:ind w:left="720" w:hanging="360"/>
         <w:spacing w:after="80"/>
       </w:pPr>
-    </w:p>
-    <w:p>
-      <w:pPr>
+      <w:r>
+        <w:rPr>
+          <w:sz w:val="22"/>
+          <w:szCs w:val="22"/>
+        </w:rPr>
+        <w:t xml:space="preserve">• Solicitud de derivacion desde el tecnico.</w:t>
+      </w:r>
+    </w:p>
+    <w:p>
+      <w:pPr>
+        <w:spacing w:before="280" w:after="120"/>
+      </w:pPr>
+      <w:r>
+        <w:rPr>
+          <w:b/>
+          <w:bCs/>
+          <w:sz w:val="28"/>
+          <w:szCs w:val="28"/>
+        </w:rPr>
+        <w:t xml:space="preserve">5. Tipos de reclamo (municipio)</w:t>
+      </w:r>
+    </w:p>
+    <w:p>
+      <w:pPr>
+        <w:ind w:left="720" w:hanging="360"/>
         <w:spacing w:after="80"/>
       </w:pPr>
       <w:r>
-        <w:t>l</w:t>
-      </w:r>
-    </w:p>
-    <w:p>
-      <w:pPr>
+        <w:rPr>
+          <w:sz w:val="22"/>
+          <w:szCs w:val="22"/>
+        </w:rPr>
+        <w:t xml:space="preserve">• Alumbrado publico; bacheo; recoleccion y poda.</w:t>
+      </w:r>
+    </w:p>
+    <w:p>
+      <w:pPr>
+        <w:ind w:left="720" w:hanging="360"/>
         <w:spacing w:after="80"/>
       </w:pPr>
       <w:r>
-        <w:t>1</w:t>
-      </w:r>
-    </w:p>
-    <w:p>
-      <w:pPr>
+        <w:rPr>
+          <w:sz w:val="22"/>
+          <w:szCs w:val="22"/>
+        </w:rPr>
+        <w:t xml:space="preserve">• Espacios verdes; cloacas y alcantarillas.</w:t>
+      </w:r>
+    </w:p>
+    <w:p>
+      <w:pPr>
+        <w:ind w:left="720" w:hanging="360"/>
         <w:spacing w:after="80"/>
       </w:pPr>
       <w:r>
-        <w:t>.</w:t>
-      </w:r>
-    </w:p>
-    <w:p>
-      <w:pPr>
+        <w:rPr>
+          <w:sz w:val="22"/>
+          <w:szCs w:val="22"/>
+        </w:rPr>
+        <w:t xml:space="preserve">• Transito (con subtipos en WhatsApp y panel).</w:t>
+      </w:r>
+    </w:p>
+    <w:p>
+      <w:pPr>
+        <w:ind w:left="720" w:hanging="360"/>
         <w:spacing w:after="80"/>
       </w:pPr>
       <w:r>
-        <w:t>u</w:t>
-      </w:r>
-    </w:p>
-    <w:p>
-      <w:pPr>
+        <w:rPr>
+          <w:sz w:val="22"/>
+          <w:szCs w:val="22"/>
+        </w:rPr>
+        <w:t xml:space="preserve">• Ruidos molestos; animales; orden publico (con subtipos).</w:t>
+      </w:r>
+    </w:p>
+    <w:p>
+      <w:pPr>
+        <w:ind w:left="720" w:hanging="360"/>
         <w:spacing w:after="80"/>
       </w:pPr>
       <w:r>
-        <w:t>e</w:t>
-      </w:r>
-    </w:p>
-    <w:p>
-      <w:pPr>
+        <w:rPr>
+          <w:sz w:val="22"/>
+          <w:szCs w:val="22"/>
+        </w:rPr>
+        <w:t xml:space="preserve">• Otros reclamos generales.</w:t>
+      </w:r>
+    </w:p>
+    <w:p>
+      <w:pPr>
+        <w:spacing w:before="280" w:after="120"/>
+      </w:pPr>
+      <w:r>
+        <w:rPr>
+          <w:b/>
+          <w:bCs/>
+          <w:sz w:val="28"/>
+          <w:szCs w:val="28"/>
+        </w:rPr>
+        <w:t xml:space="preserve">6. Beneficios</w:t>
+      </w:r>
+    </w:p>
+    <w:p>
+      <w:pPr>
+        <w:ind w:left="720" w:hanging="360"/>
         <w:spacing w:after="80"/>
       </w:pPr>
       <w:r>
-        <w:t>1</w:t>
-      </w:r>
-    </w:p>
-    <w:p>
-      <w:pPr>
+        <w:rPr>
+          <w:sz w:val="22"/>
+          <w:szCs w:val="22"/>
+        </w:rPr>
+        <w:t xml:space="preserve">• Un solo sistema para toda la gestion municipal.</w:t>
+      </w:r>
+    </w:p>
+    <w:p>
+      <w:pPr>
+        <w:ind w:left="720" w:hanging="360"/>
         <w:spacing w:after="80"/>
       </w:pPr>
       <w:r>
-        <w:t>.</w:t>
-      </w:r>
-    </w:p>
-    <w:p>
-      <w:pPr>
+        <w:rPr>
+          <w:sz w:val="22"/>
+          <w:szCs w:val="22"/>
+        </w:rPr>
+        <w:t xml:space="preserve">• Vecino informado por WhatsApp en cada etapa.</w:t>
+      </w:r>
+    </w:p>
+    <w:p>
+      <w:pPr>
+        <w:ind w:left="720" w:hanging="360"/>
         <w:spacing w:after="80"/>
       </w:pPr>
       <w:r>
-        <w:t>u</w:t>
-      </w:r>
-    </w:p>
-    <w:p>
-      <w:pPr>
-        <w:spacing w:after="80"/>
-      </w:pPr>
-      <w:r>
-        <w:t>a</w:t>
-      </w:r>
-    </w:p>
-    <w:p>
-      <w:pPr>
-        <w:spacing w:after="80"/>
-      </w:pPr>
-      <w:r>
-        <w:t>u</w:t>
-      </w:r>
-    </w:p>
-    <w:p>
-      <w:pPr>
-        <w:spacing w:after="80"/>
-      </w:pPr>
-      <w:r>
-        <w:t>n</w:t>
-      </w:r>
-    </w:p>
-    <w:p>
-      <w:pPr>
-        <w:spacing w:after="80"/>
-      </w:pPr>
-      <w:r>
-        <w:t>u</w:t>
-      </w:r>
-    </w:p>
-    <w:p>
-      <w:pPr>
-        <w:spacing w:after="80"/>
-      </w:pPr>
-      <w:r>
-        <w:t>a</w:t>
-      </w:r>
-    </w:p>
-    <w:p>
-      <w:pPr>
-        <w:spacing w:after="80"/>
-      </w:pPr>
-      <w:r>
-        <w:t>u</w:t>
-      </w:r>
-    </w:p>
-    <w:p>
-      <w:pPr>
-        <w:spacing w:after="80"/>
-      </w:pPr>
-      <w:r>
-        <w:t>u</w:t>
-      </w:r>
-    </w:p>
-    <w:p>
-      <w:pPr>
-        <w:spacing w:after="80"/>
-      </w:pPr>
-      <w:r>
-        <w:t>u</w:t>
-      </w:r>
-    </w:p>
-    <w:p>
-      <w:pPr>
-        <w:spacing w:after="80"/>
-      </w:pPr>
-      <w:r>
-        <w:t>e</w:t>
-      </w:r>
-    </w:p>
-    <w:p>
-      <w:pPr>
-        <w:spacing w:after="80"/>
-      </w:pPr>
-      <w:r>
-        <w:t>u</w:t>
-      </w:r>
-    </w:p>
-    <w:p>
-      <w:pPr>
-        <w:spacing w:after="80"/>
-      </w:pPr>
-      <w:r>
-        <w:t>s</w:t>
-      </w:r>
-    </w:p>
-    <w:p>
-      <w:pPr>
-        <w:spacing w:after="80"/>
-      </w:pPr>
-      <w:r>
-        <w:t>1</w:t>
-      </w:r>
-    </w:p>
-    <w:p>
-      <w:pPr>
-        <w:spacing w:after="80"/>
-      </w:pPr>
-      <w:r>
-        <w:t>.</w:t>
-      </w:r>
-    </w:p>
-    <w:p>
-      <w:pPr>
-        <w:spacing w:after="80"/>
-      </w:pPr>
-      <w:r>
-        <w:t>u</w:t>
-      </w:r>
-    </w:p>
-    <w:p>
-      <w:pPr>
-        <w:spacing w:after="80"/>
-      </w:pPr>
-      <w:r>
-        <w:t>e</w:t>
-      </w:r>
-    </w:p>
-    <w:p>
-      <w:pPr>
-        <w:spacing w:after="80"/>
-      </w:pPr>
-      <w:r>
-        <w:t>1</w:t>
-      </w:r>
-    </w:p>
-    <w:p>
-      <w:pPr>
-        <w:spacing w:after="80"/>
-      </w:pPr>
-      <w:r>
-        <w:t>.</w:t>
-      </w:r>
-    </w:p>
-    <w:p>
-      <w:pPr>
-        <w:spacing w:after="80"/>
-      </w:pPr>
-      <w:r>
-        <w:t>u</w:t>
-      </w:r>
-    </w:p>
-    <w:p>
-      <w:pPr>
-        <w:spacing w:after="80"/>
-      </w:pPr>
-      <w:r>
-        <w:t>l</w:t>
-      </w:r>
-    </w:p>
-    <w:p>
-      <w:pPr>
-        <w:spacing w:after="80"/>
-      </w:pPr>
-      <w:r>
-        <w:t>u</w:t>
-      </w:r>
-    </w:p>
-    <w:p>
-      <w:pPr>
-        <w:spacing w:after="80"/>
-      </w:pPr>
-      <w:r>
-        <w:t>l</w:t>
-      </w:r>
-    </w:p>
-    <w:p>
-      <w:pPr>
-        <w:spacing w:after="80"/>
-      </w:pPr>
-      <w:r>
-        <w:t>u</w:t>
-      </w:r>
-    </w:p>
-    <w:p>
-      <w:pPr>
-        <w:spacing w:after="80"/>
-      </w:pPr>
-      <w:r>
-        <w:t>u</w:t>
-      </w:r>
-    </w:p>
-    <w:p>
-      <w:pPr>
-        <w:spacing w:after="80"/>
-      </w:pPr>
-      <w:r>
-        <w:t>1</w:t>
-      </w:r>
-    </w:p>
-    <w:p>
-      <w:pPr>
-        <w:spacing w:after="80"/>
-      </w:pPr>
-      <w:r>
-        <w:t>.</w:t>
-      </w:r>
-    </w:p>
-    <w:p>
-      <w:pPr>
-        <w:spacing w:after="80"/>
-      </w:pPr>
-      <w:r>
-        <w:t>u</w:t>
-      </w:r>
-    </w:p>
-    <w:p>
-      <w:pPr>
-        <w:spacing w:after="80"/>
-      </w:pPr>
-      <w:r>
-        <w:t>n</w:t>
-      </w:r>
-    </w:p>
-    <w:p>
-      <w:pPr>
-        <w:spacing w:after="80"/>
-      </w:pPr>
-      <w:r>
-        <w:t>1</w:t>
-      </w:r>
-    </w:p>
-    <w:p>
-      <w:pPr>
-        <w:spacing w:after="80"/>
-      </w:pPr>
-      <w:r>
-        <w:t>n</w:t>
-      </w:r>
-    </w:p>
-    <w:p>
-      <w:pPr>
-        <w:spacing w:after="80"/>
-      </w:pPr>
-    </w:p>
-    <w:p>
-      <w:pPr>
-        <w:spacing w:after="80"/>
-      </w:pPr>
-      <w:r>
-        <w:t>o</w:t>
-      </w:r>
-    </w:p>
-    <w:p>
-      <w:pPr>
-        <w:spacing w:after="80"/>
-      </w:pPr>
+        <w:rPr>
+          <w:sz w:val="22"/>
+          <w:szCs w:val="22"/>
+        </w:rPr>
+        <w:t xml:space="preserve">• Evidencia documentada para Concejo Deliberante y transparencia.</w:t>
+      </w:r>
+    </w:p>
+    <w:p>
+      <w:pPr>
+        <w:spacing w:before="280" w:after="120"/>
+      </w:pPr>
+      <w:r>
+        <w:rPr>
+          <w:b/>
+          <w:bCs/>
+          <w:sz w:val="28"/>
+          <w:szCs w:val="28"/>
+        </w:rPr>
+        <w:t xml:space="preserve">Anexo: WHAPI_BROADCAST_BLOCK_ON_LOW_RATIO</w:t>
+      </w:r>
+    </w:p>
+    <w:p>
+      <w:pPr>
+        <w:spacing w:after="120" w:line="276" w:lineRule="auto"/>
+      </w:pPr>
+      <w:r>
+        <w:rPr>
+          <w:sz w:val="22"/>
+          <w:szCs w:val="22"/>
+        </w:rPr>
+        <w:t xml:space="preserve">Por defecto desactivada (0). Con valor 1 bloquea masivos solo si el ratio de respuestas es bajo 3 dias seguidos.</w:t>
+      </w:r>
     </w:p>
     <w:sectPr>
       <w:pgSz w:w="11906" w:h="16838"/>
-      <w:pgMar w:top="1417" w:right="1701" w:bottom="1417" w:left="1701" w:header="708" w:footer="708" w:gutter="0"/>
-      <w:cols w:space="708"/>
-      <w:docGrid w:linePitch="360"/>
+      <w:pgMar w:top="1440" w:right="1440" w:bottom="1440" w:left="1440"/>
     </w:sectPr>
   </w:body>
 </w:document>
 </file>
 
-<file path=word/styles.xml><?xml version="1.0" encoding="utf-8"?>
+<file path=word\fontTable.xml><?xml version="1.0" encoding="utf-8"?>
+<w:fonts xmlns:mc="http://schemas.openxmlformats.org/markup-compatibility/2006" xmlns:r="http://schemas.openxmlformats.org/officeDocument/2006/relationships" xmlns:w="http://schemas.openxmlformats.org/wordprocessingml/2006/main" xmlns:w14="http://schemas.microsoft.com/office/word/2010/wordml" xmlns:w15="http://schemas.microsoft.com/office/word/2012/wordml" xmlns:w16cex="http://schemas.microsoft.com/office/word/2018/wordml/cex" xmlns:w16cid="http://schemas.microsoft.com/office/word/2016/wordml/cid" xmlns:w16="http://schemas.microsoft.com/office/word/2018/wordml" xmlns:w16du="http://schemas.microsoft.com/office/word/2023/wordml/word16du" xmlns:w16sdtdh="http://schemas.microsoft.com/office/word/2020/wordml/sdtdatahash" xmlns:w16sdtfl="http://schemas.microsoft.com/office/word/2024/wordml/sdtformatlock" xmlns:w16se="http://schemas.microsoft.com/office/word/2015/wordml/symex" mc:Ignorable="w14 w15 w16se w16cid w16 w16cex w16sdtdh w16sdtfl w16du">
+  <w:font w:name="Aptos">
+    <w:charset w:val="00"/>
+    <w:family w:val="swiss"/>
+    <w:pitch w:val="variable"/>
+    <w:sig w:usb0="20000287" w:usb1="00000003" w:usb2="00000000" w:usb3="00000000" w:csb0="0000019F" w:csb1="00000000"/>
+  </w:font>
+  <w:font w:name="Times New Roman">
+    <w:panose1 w:val="02020603050405020304"/>
+    <w:charset w:val="00"/>
+    <w:family w:val="roman"/>
+    <w:pitch w:val="variable"/>
+    <w:sig w:usb0="E0002EFF" w:usb1="C000785B" w:usb2="00000009" w:usb3="00000000" w:csb0="000001FF" w:csb1="00000000"/>
+  </w:font>
+  <w:font w:name="Aptos Display">
+    <w:charset w:val="00"/>
+    <w:family w:val="swiss"/>
+    <w:pitch w:val="variable"/>
+    <w:sig w:usb0="20000287" w:usb1="00000003" w:usb2="00000000" w:usb3="00000000" w:csb0="0000019F" w:csb1="00000000"/>
+  </w:font>
+  <w:font w:name="Calibri">
+    <w:panose1 w:val="020F0502020204030204"/>
+    <w:charset w:val="00"/>
+    <w:family w:val="swiss"/>
+    <w:pitch w:val="variable"/>
+    <w:sig w:usb0="E4002EFF" w:usb1="C200247B" w:usb2="00000009" w:usb3="00000000" w:csb0="000001FF" w:csb1="00000000"/>
+  </w:font>
+</w:fonts>
+</file>
+
+<file path=word\settings.xml><?xml version="1.0" encoding="utf-8"?>
+<w:settings xmlns:mc="http://schemas.openxmlformats.org/markup-compatibility/2006" xmlns:o="urn:schemas-microsoft-com:office:office" xmlns:r="http://schemas.openxmlformats.org/officeDocument/2006/relationships" xmlns:m="http://schemas.openxmlformats.org/officeDocument/2006/math" xmlns:v="urn:schemas-microsoft-com:vml" xmlns:w10="urn:schemas-microsoft-com:office:word" xmlns:w="http://schemas.openxmlformats.org/wordprocessingml/2006/main" xmlns:w14="http://schemas.microsoft.com/office/word/2010/wordml" xmlns:w15="http://schemas.microsoft.com/office/word/2012/wordml" xmlns:w16cex="http://schemas.microsoft.com/office/word/2018/wordml/cex" xmlns:w16cid="http://schemas.microsoft.com/office/word/2016/wordml/cid" xmlns:w16="http://schemas.microsoft.com/office/word/2018/wordml" xmlns:w16du="http://schemas.microsoft.com/office/word/2023/wordml/word16du" xmlns:w16sdtdh="http://schemas.microsoft.com/office/word/2020/wordml/sdtdatahash" xmlns:w16sdtfl="http://schemas.microsoft.com/office/word/2024/wordml/sdtformatlock" xmlns:w16se="http://schemas.microsoft.com/office/word/2015/wordml/symex" xmlns:sl="http://schemas.openxmlformats.org/schemaLibrary/2006/main" mc:Ignorable="w14 w15 w16se w16cid w16 w16cex w16sdtdh w16sdtfl w16du">
+  <w:zoom w:percent="100"/>
+  <w:defaultTabStop w:val="708"/>
+  <w:hyphenationZone w:val="425"/>
+  <w:characterSpacingControl w:val="doNotCompress"/>
+  <w:compat>
+    <w:compatSetting w:name="compatibilityMode" w:uri="http://schemas.microsoft.com/office/word" w:val="15"/>
+    <w:compatSetting w:name="overrideTableStyleFontSizeAndJustification" w:uri="http://schemas.microsoft.com/office/word" w:val="1"/>
+    <w:compatSetting w:name="enableOpenTypeFeatures" w:uri="http://schemas.microsoft.com/office/word" w:val="1"/>
+    <w:compatSetting w:name="doNotFlipMirrorIndents" w:uri="http://schemas.microsoft.com/office/word" w:val="1"/>
+    <w:compatSetting w:name="differentiateMultirowTableHeaders" w:uri="http://schemas.microsoft.com/office/word" w:val="1"/>
+    <w:compatSetting w:name="useWord2013TrackBottomHyphenation" w:uri="http://schemas.microsoft.com/office/word" w:val="0"/>
+  </w:compat>
+  <w:rsids>
+    <w:rsidRoot w:val="00FA5BCA"/>
+    <w:rsid w:val="0018477E"/>
+    <w:rsid w:val="002A1720"/>
+    <w:rsid w:val="0072054D"/>
+    <w:rsid w:val="00B7576E"/>
+    <w:rsid w:val="00EF77E9"/>
+    <w:rsid w:val="00FA5BCA"/>
+  </w:rsids>
+  <m:mathPr>
+    <m:mathFont m:val="Cambria Math"/>
+    <m:brkBin m:val="before"/>
+    <m:brkBinSub m:val="--"/>
+    <m:smallFrac m:val="0"/>
+    <m:dispDef/>
+    <m:lMargin m:val="0"/>
+    <m:rMargin m:val="0"/>
+    <m:defJc m:val="centerGroup"/>
+    <m:wrapIndent m:val="1440"/>
+    <m:intLim m:val="subSup"/>
+    <m:naryLim m:val="undOvr"/>
+  </m:mathPr>
+  <w:themeFontLang w:val="es-AR"/>
+  <w:clrSchemeMapping w:bg1="light1" w:t1="dark1" w:bg2="light2" w:t2="dark2" w:accent1="accent1" w:accent2="accent2" w:accent3="accent3" w:accent4="accent4" w:accent5="accent5" w:accent6="accent6" w:hyperlink="hyperlink" w:followedHyperlink="followedHyperlink"/>
+  <w:shapeDefaults>
+    <o:shapedefaults v:ext="edit" spidmax="1026"/>
+    <o:shapelayout v:ext="edit">
+      <o:idmap v:ext="edit" data="1"/>
+    </o:shapelayout>
+  </w:shapeDefaults>
+  <w:decimalSymbol w:val=","/>
+  <w:listSeparator w:val=";"/>
+  <w14:docId w14:val="6C08A946"/>
+  <w15:chartTrackingRefBased/>
+  <w15:docId w15:val="{28FAA235-2CFA-49F8-AB04-8331112CD26C}"/>
+</w:settings>
+</file>
+
+<file path=word\styles.xml><?xml version="1.0" encoding="utf-8"?>
 <w:styles xmlns:mc="http://schemas.openxmlformats.org/markup-compatibility/2006" xmlns:r="http://schemas.openxmlformats.org/officeDocument/2006/relationships" xmlns:w="http://schemas.openxmlformats.org/wordprocessingml/2006/main" xmlns:w14="http://schemas.microsoft.com/office/word/2010/wordml" xmlns:w15="http://schemas.microsoft.com/office/word/2012/wordml" xmlns:w16cex="http://schemas.microsoft.com/office/word/2018/wordml/cex" xmlns:w16cid="http://schemas.microsoft.com/office/word/2016/wordml/cid" xmlns:w16="http://schemas.microsoft.com/office/word/2018/wordml" xmlns:w16du="http://schemas.microsoft.com/office/word/2023/wordml/word16du" xmlns:w16sdtdh="http://schemas.microsoft.com/office/word/2020/wordml/sdtdatahash" xmlns:w16sdtfl="http://schemas.microsoft.com/office/word/2024/wordml/sdtformatlock" xmlns:w16se="http://schemas.microsoft.com/office/word/2015/wordml/symex" mc:Ignorable="w14 w15 w16se w16cid w16 w16cex w16sdtdh w16sdtfl w16du">
   <w:docDefaults>
     <w:rPrDefault>
@@ -839,7 +1519,7 @@
     <w:link w:val="Ttulo1Car"/>
     <w:uiPriority w:val="9"/>
     <w:qFormat/>
-    <w:rsid w:val="00AB1BFB"/>
+    <w:rsid w:val="00FA5BCA"/>
     <w:pPr>
       <w:keepNext/>
       <w:keepLines/>
@@ -862,7 +1542,7 @@
     <w:semiHidden/>
     <w:unhideWhenUsed/>
     <w:qFormat/>
-    <w:rsid w:val="00AB1BFB"/>
+    <w:rsid w:val="00FA5BCA"/>
     <w:pPr>
       <w:keepNext/>
       <w:keepLines/>
@@ -885,7 +1565,7 @@
     <w:semiHidden/>
     <w:unhideWhenUsed/>
     <w:qFormat/>
-    <w:rsid w:val="00AB1BFB"/>
+    <w:rsid w:val="00FA5BCA"/>
     <w:pPr>
       <w:keepNext/>
       <w:keepLines/>
@@ -908,7 +1588,7 @@
     <w:semiHidden/>
     <w:unhideWhenUsed/>
     <w:qFormat/>
-    <w:rsid w:val="00AB1BFB"/>
+    <w:rsid w:val="00FA5BCA"/>
     <w:pPr>
       <w:keepNext/>
       <w:keepLines/>
@@ -931,7 +1611,7 @@
     <w:semiHidden/>
     <w:unhideWhenUsed/>
     <w:qFormat/>
-    <w:rsid w:val="00AB1BFB"/>
+    <w:rsid w:val="00FA5BCA"/>
     <w:pPr>
       <w:keepNext/>
       <w:keepLines/>
@@ -952,7 +1632,7 @@
     <w:semiHidden/>
     <w:unhideWhenUsed/>
     <w:qFormat/>
-    <w:rsid w:val="00AB1BFB"/>
+    <w:rsid w:val="00FA5BCA"/>
     <w:pPr>
       <w:keepNext/>
       <w:keepLines/>
@@ -975,7 +1655,7 @@
     <w:semiHidden/>
     <w:unhideWhenUsed/>
     <w:qFormat/>
-    <w:rsid w:val="00AB1BFB"/>
+    <w:rsid w:val="00FA5BCA"/>
     <w:pPr>
       <w:keepNext/>
       <w:keepLines/>
@@ -996,7 +1676,7 @@
     <w:semiHidden/>
     <w:unhideWhenUsed/>
     <w:qFormat/>
-    <w:rsid w:val="00AB1BFB"/>
+    <w:rsid w:val="00FA5BCA"/>
     <w:pPr>
       <w:keepNext/>
       <w:keepLines/>
@@ -1019,7 +1699,7 @@
     <w:semiHidden/>
     <w:unhideWhenUsed/>
     <w:qFormat/>
-    <w:rsid w:val="00AB1BFB"/>
+    <w:rsid w:val="00FA5BCA"/>
     <w:pPr>
       <w:keepNext/>
       <w:keepLines/>
@@ -1063,7 +1743,7 @@
     <w:basedOn w:val="Fuentedeprrafopredeter"/>
     <w:link w:val="Ttulo1"/>
     <w:uiPriority w:val="9"/>
-    <w:rsid w:val="00AB1BFB"/>
+    <w:rsid w:val="00FA5BCA"/>
     <w:rPr>
       <w:rFonts w:asciiTheme="majorHAnsi" w:eastAsiaTheme="majorEastAsia" w:hAnsiTheme="majorHAnsi" w:cstheme="majorBidi"/>
       <w:color w:val="0F4761" w:themeColor="accent1" w:themeShade="BF"/>
@@ -1077,7 +1757,7 @@
     <w:link w:val="Ttulo2"/>
     <w:uiPriority w:val="9"/>
     <w:semiHidden/>
-    <w:rsid w:val="00AB1BFB"/>
+    <w:rsid w:val="00FA5BCA"/>
     <w:rPr>
       <w:rFonts w:asciiTheme="majorHAnsi" w:eastAsiaTheme="majorEastAsia" w:hAnsiTheme="majorHAnsi" w:cstheme="majorBidi"/>
       <w:color w:val="0F4761" w:themeColor="accent1" w:themeShade="BF"/>
@@ -1091,7 +1771,7 @@
     <w:link w:val="Ttulo3"/>
     <w:uiPriority w:val="9"/>
     <w:semiHidden/>
-    <w:rsid w:val="00AB1BFB"/>
+    <w:rsid w:val="00FA5BCA"/>
     <w:rPr>
       <w:rFonts w:eastAsiaTheme="majorEastAsia" w:cstheme="majorBidi"/>
       <w:color w:val="0F4761" w:themeColor="accent1" w:themeShade="BF"/>
@@ -1105,7 +1785,7 @@
     <w:link w:val="Ttulo4"/>
     <w:uiPriority w:val="9"/>
     <w:semiHidden/>
-    <w:rsid w:val="00AB1BFB"/>
+    <w:rsid w:val="00FA5BCA"/>
     <w:rPr>
       <w:rFonts w:eastAsiaTheme="majorEastAsia" w:cstheme="majorBidi"/>
       <w:i/>
@@ -1119,7 +1799,7 @@
     <w:link w:val="Ttulo5"/>
     <w:uiPriority w:val="9"/>
     <w:semiHidden/>
-    <w:rsid w:val="00AB1BFB"/>
+    <w:rsid w:val="00FA5BCA"/>
     <w:rPr>
       <w:rFonts w:eastAsiaTheme="majorEastAsia" w:cstheme="majorBidi"/>
       <w:color w:val="0F4761" w:themeColor="accent1" w:themeShade="BF"/>
@@ -1131,7 +1811,7 @@
     <w:link w:val="Ttulo6"/>
     <w:uiPriority w:val="9"/>
     <w:semiHidden/>
-    <w:rsid w:val="00AB1BFB"/>
+    <w:rsid w:val="00FA5BCA"/>
     <w:rPr>
       <w:rFonts w:eastAsiaTheme="majorEastAsia" w:cstheme="majorBidi"/>
       <w:i/>
@@ -1145,7 +1825,7 @@
     <w:link w:val="Ttulo7"/>
     <w:uiPriority w:val="9"/>
     <w:semiHidden/>
-    <w:rsid w:val="00AB1BFB"/>
+    <w:rsid w:val="00FA5BCA"/>
     <w:rPr>
       <w:rFonts w:eastAsiaTheme="majorEastAsia" w:cstheme="majorBidi"/>
       <w:color w:val="595959" w:themeColor="text1" w:themeTint="A6"/>
@@ -1157,7 +1837,7 @@
     <w:link w:val="Ttulo8"/>
     <w:uiPriority w:val="9"/>
     <w:semiHidden/>
-    <w:rsid w:val="00AB1BFB"/>
+    <w:rsid w:val="00FA5BCA"/>
     <w:rPr>
       <w:rFonts w:eastAsiaTheme="majorEastAsia" w:cstheme="majorBidi"/>
       <w:i/>
@@ -1171,7 +1851,7 @@
     <w:link w:val="Ttulo9"/>
     <w:uiPriority w:val="9"/>
     <w:semiHidden/>
-    <w:rsid w:val="00AB1BFB"/>
+    <w:rsid w:val="00FA5BCA"/>
     <w:rPr>
       <w:rFonts w:eastAsiaTheme="majorEastAsia" w:cstheme="majorBidi"/>
       <w:color w:val="272727" w:themeColor="text1" w:themeTint="D8"/>
@@ -1184,7 +1864,7 @@
     <w:link w:val="TtuloCar"/>
     <w:uiPriority w:val="10"/>
     <w:qFormat/>
-    <w:rsid w:val="00AB1BFB"/>
+    <w:rsid w:val="00FA5BCA"/>
     <w:pPr>
       <w:spacing w:after="80" w:line="240" w:lineRule="auto"/>
       <w:contextualSpacing/>
@@ -1202,7 +1882,7 @@
     <w:basedOn w:val="Fuentedeprrafopredeter"/>
     <w:link w:val="Ttulo"/>
     <w:uiPriority w:val="10"/>
-    <w:rsid w:val="00AB1BFB"/>
+    <w:rsid w:val="00FA5BCA"/>
     <w:rPr>
       <w:rFonts w:asciiTheme="majorHAnsi" w:eastAsiaTheme="majorEastAsia" w:hAnsiTheme="majorHAnsi" w:cstheme="majorBidi"/>
       <w:spacing w:val="-10"/>
@@ -1218,7 +1898,7 @@
     <w:link w:val="SubttuloCar"/>
     <w:uiPriority w:val="11"/>
     <w:qFormat/>
-    <w:rsid w:val="00AB1BFB"/>
+    <w:rsid w:val="00FA5BCA"/>
     <w:pPr>
       <w:numPr>
         <w:ilvl w:val="1"/>
@@ -1237,7 +1917,7 @@
     <w:basedOn w:val="Fuentedeprrafopredeter"/>
     <w:link w:val="Subttulo"/>
     <w:uiPriority w:val="11"/>
-    <w:rsid w:val="00AB1BFB"/>
+    <w:rsid w:val="00FA5BCA"/>
     <w:rPr>
       <w:rFonts w:eastAsiaTheme="majorEastAsia" w:cstheme="majorBidi"/>
       <w:color w:val="595959" w:themeColor="text1" w:themeTint="A6"/>
@@ -1253,7 +1933,7 @@
     <w:link w:val="CitaCar"/>
     <w:uiPriority w:val="29"/>
     <w:qFormat/>
-    <w:rsid w:val="00AB1BFB"/>
+    <w:rsid w:val="00FA5BCA"/>
     <w:pPr>
       <w:spacing w:before="160"/>
       <w:jc w:val="center"/>
@@ -1269,7 +1949,7 @@
     <w:basedOn w:val="Fuentedeprrafopredeter"/>
     <w:link w:val="Cita"/>
     <w:uiPriority w:val="29"/>
-    <w:rsid w:val="00AB1BFB"/>
+    <w:rsid w:val="00FA5BCA"/>
     <w:rPr>
       <w:i/>
       <w:iCs/>
@@ -1281,7 +1961,7 @@
     <w:basedOn w:val="Normal"/>
     <w:uiPriority w:val="34"/>
     <w:qFormat/>
-    <w:rsid w:val="00AB1BFB"/>
+    <w:rsid w:val="00FA5BCA"/>
     <w:pPr>
       <w:ind w:left="720"/>
       <w:contextualSpacing/>
@@ -1292,7 +1972,7 @@
     <w:basedOn w:val="Fuentedeprrafopredeter"/>
     <w:uiPriority w:val="21"/>
     <w:qFormat/>
-    <w:rsid w:val="00AB1BFB"/>
+    <w:rsid w:val="00FA5BCA"/>
     <w:rPr>
       <w:i/>
       <w:iCs/>
@@ -1306,7 +1986,7 @@
     <w:link w:val="CitadestacadaCar"/>
     <w:uiPriority w:val="30"/>
     <w:qFormat/>
-    <w:rsid w:val="00AB1BFB"/>
+    <w:rsid w:val="00FA5BCA"/>
     <w:pPr>
       <w:pBdr>
         <w:top w:val="single" w:sz="4" w:space="10" w:color="0F4761" w:themeColor="accent1" w:themeShade="BF"/>
@@ -1327,7 +2007,7 @@
     <w:basedOn w:val="Fuentedeprrafopredeter"/>
     <w:link w:val="Citadestacada"/>
     <w:uiPriority w:val="30"/>
-    <w:rsid w:val="00AB1BFB"/>
+    <w:rsid w:val="00FA5BCA"/>
     <w:rPr>
       <w:i/>
       <w:iCs/>
@@ -1339,7 +2019,7 @@
     <w:basedOn w:val="Fuentedeprrafopredeter"/>
     <w:uiPriority w:val="32"/>
     <w:qFormat/>
-    <w:rsid w:val="00AB1BFB"/>
+    <w:rsid w:val="00FA5BCA"/>
     <w:rPr>
       <w:b/>
       <w:bCs/>
@@ -1351,7 +2031,7 @@
 </w:styles>
 </file>
 
-<file path=word/theme/theme1.xml><?xml version="1.0" encoding="utf-8"?>
+<file path=word\theme\theme1.xml><?xml version="1.0" encoding="utf-8"?>
 <a:theme xmlns:a="http://schemas.openxmlformats.org/drawingml/2006/main" name="Tema de Office">
   <a:themeElements>
     <a:clrScheme name="Office">
@@ -1644,4 +2324,11 @@
     </a:ext>
   </a:extLst>
 </a:theme>
+</file>
+
+<file path=word\webSettings.xml><?xml version="1.0" encoding="utf-8"?>
+<w:webSettings xmlns:mc="http://schemas.openxmlformats.org/markup-compatibility/2006" xmlns:r="http://schemas.openxmlformats.org/officeDocument/2006/relationships" xmlns:w="http://schemas.openxmlformats.org/wordprocessingml/2006/main" xmlns:w14="http://schemas.microsoft.com/office/word/2010/wordml" xmlns:w15="http://schemas.microsoft.com/office/word/2012/wordml" xmlns:w16cex="http://schemas.microsoft.com/office/word/2018/wordml/cex" xmlns:w16cid="http://schemas.microsoft.com/office/word/2016/wordml/cid" xmlns:w16="http://schemas.microsoft.com/office/word/2018/wordml" xmlns:w16du="http://schemas.microsoft.com/office/word/2023/wordml/word16du" xmlns:w16sdtdh="http://schemas.microsoft.com/office/word/2020/wordml/sdtdatahash" xmlns:w16sdtfl="http://schemas.microsoft.com/office/word/2024/wordml/sdtformatlock" xmlns:w16se="http://schemas.microsoft.com/office/word/2015/wordml/symex" mc:Ignorable="w14 w15 w16se w16cid w16 w16cex w16sdtdh w16sdtfl w16du">
+  <w:optimizeForBrowser/>
+  <w:allowPNG/>
+</w:webSettings>
 </file>
</xml_diff>